<commit_message>
normalizacion de ficheros ai y config
</commit_message>
<xml_diff>
--- a/WORLDWIDE.docx
+++ b/WORLDWIDE.docx
@@ -4385,7 +4385,7 @@
               <wp:anchor behindDoc="0" distT="19050" distB="42545" distL="635" distR="2540" simplePos="0" locked="0" layoutInCell="1" allowOverlap="1" relativeHeight="8" wp14:anchorId="633862A7">
                 <wp:simplePos x="0" y="0"/>
                 <wp:positionH relativeFrom="column">
-                  <wp:posOffset>1221740</wp:posOffset>
+                  <wp:posOffset>1221105</wp:posOffset>
                 </wp:positionH>
                 <wp:positionV relativeFrom="paragraph">
                   <wp:posOffset>542290</wp:posOffset>
@@ -4439,7 +4439,7 @@
                 <v:stroke joinstyle="miter"/>
                 <v:path gradientshapeok="t" o:connecttype="rect" textboxrect="0,0,21600,21600"/>
               </v:shapetype>
-              <v:shape id="shape_0" stroked="t" o:allowincell="f" style="position:absolute;margin-left:96.2pt;margin-top:42.7pt;width:119.15pt;height:15.45pt;flip:x;mso-wrap-style:none;v-text-anchor:middle" wp14:anchorId="633862A7" type="_x0000_t32" path="m0,0l-2147483648,-2147483647e">
+              <v:shape id="shape_0" stroked="t" o:allowincell="f" style="position:absolute;margin-left:96.15pt;margin-top:42.7pt;width:119.15pt;height:15.45pt;flip:x;mso-wrap-style:none;v-text-anchor:middle" wp14:anchorId="633862A7" type="_x0000_t32" path="m0,0l-2147483648,-2147483647e">
                 <v:fill o:detectmouseclick="t" on="false"/>
                 <v:stroke color="#ffe701" weight="38160" endarrow="block" endarrowwidth="medium" endarrowlength="medium" joinstyle="miter" endcap="flat"/>
                 <w10:wrap type="none"/>
@@ -4628,7 +4628,7 @@
               <wp:anchor behindDoc="0" distT="19050" distB="42545" distL="635" distR="2540" simplePos="0" locked="0" layoutInCell="1" allowOverlap="1" relativeHeight="7" wp14:anchorId="6CF38316">
                 <wp:simplePos x="0" y="0"/>
                 <wp:positionH relativeFrom="column">
-                  <wp:posOffset>1248410</wp:posOffset>
+                  <wp:posOffset>1247775</wp:posOffset>
                 </wp:positionH>
                 <wp:positionV relativeFrom="paragraph">
                   <wp:posOffset>1214755</wp:posOffset>
@@ -4678,7 +4678,7 @@
           </mc:Choice>
           <mc:Fallback>
             <w:pict>
-              <v:shape id="shape_0" stroked="t" o:allowincell="f" style="position:absolute;margin-left:98.3pt;margin-top:95.65pt;width:119.15pt;height:15.45pt;flip:x;mso-wrap-style:none;v-text-anchor:middle" wp14:anchorId="6CF38316" type="_x0000_t32" path="m0,0l-2147483648,-2147483647e">
+              <v:shape id="shape_0" stroked="t" o:allowincell="f" style="position:absolute;margin-left:98.25pt;margin-top:95.65pt;width:119.15pt;height:15.45pt;flip:x;mso-wrap-style:none;v-text-anchor:middle" wp14:anchorId="6CF38316" type="_x0000_t32" path="m0,0l-2147483648,-2147483647e">
                 <v:fill o:detectmouseclick="t" on="false"/>
                 <v:stroke color="#ffe701" weight="38160" endarrow="block" endarrowwidth="medium" endarrowlength="medium" joinstyle="miter" endcap="flat"/>
                 <w10:wrap type="none"/>
@@ -7763,18 +7763,17 @@
         <w:pStyle w:val="Normal"/>
         <w:spacing w:lineRule="auto" w:line="240" w:before="0" w:after="0"/>
         <w:rPr>
-          <w:b/>
-          <w:bCs/>
-          <w:sz w:val="12"/>
-          <w:szCs w:val="12"/>
-        </w:rPr>
-      </w:pPr>
-      <w:r>
-        <w:rPr>
-          <w:b/>
-          <w:bCs/>
-          <w:sz w:val="12"/>
-          <w:szCs w:val="12"/>
+          <w:highlight w:val="none"/>
+          <w:shd w:fill="BBE33D" w:val="clear"/>
+        </w:rPr>
+      </w:pPr>
+      <w:r>
+        <w:rPr>
+          <w:b/>
+          <w:bCs/>
+          <w:sz w:val="12"/>
+          <w:szCs w:val="12"/>
+          <w:shd w:fill="BBE33D" w:val="clear"/>
         </w:rPr>
         <w:t>name: area_by_NUTS_3_region</w:t>
       </w:r>
@@ -7907,7 +7906,17 @@
           <w:sz w:val="12"/>
           <w:szCs w:val="12"/>
         </w:rPr>
-        <w:t>name: gross_domestic_product_GDP_at_current_market_prices_by_NUTS_3_region</w:t>
+        <w:t xml:space="preserve">name: </w:t>
+      </w:r>
+      <w:r>
+        <w:rPr>
+          <w:b/>
+          <w:bCs/>
+          <w:sz w:val="12"/>
+          <w:szCs w:val="12"/>
+          <w:shd w:fill="BBE33D" w:val="clear"/>
+        </w:rPr>
+        <w:t>gross_domestic_product_GDP_at_current_market_prices_by_NUTS_3_region</w:t>
       </w:r>
     </w:p>
     <w:p>
@@ -8088,7 +8097,17 @@
           <w:sz w:val="12"/>
           <w:szCs w:val="12"/>
         </w:rPr>
-        <w:t>name: population_on_1_january_by_broad_age_group_sex_and_NUTS_3_region</w:t>
+        <w:t xml:space="preserve">name: </w:t>
+      </w:r>
+      <w:r>
+        <w:rPr>
+          <w:b/>
+          <w:bCs/>
+          <w:sz w:val="12"/>
+          <w:szCs w:val="12"/>
+          <w:shd w:fill="BBE33D" w:val="clear"/>
+        </w:rPr>
+        <w:t>population_on_1_january_by_broad_age_group_sex_and_NUTS_3_region</w:t>
       </w:r>
     </w:p>
     <w:p>
@@ -8248,7 +8267,17 @@
           <w:sz w:val="12"/>
           <w:szCs w:val="12"/>
         </w:rPr>
-        <w:t>name: population_on_1_january_by_broad_age_group_sex_and_NUTS_3_region</w:t>
+        <w:t xml:space="preserve">name: </w:t>
+      </w:r>
+      <w:r>
+        <w:rPr>
+          <w:b/>
+          <w:bCs/>
+          <w:sz w:val="12"/>
+          <w:szCs w:val="12"/>
+          <w:shd w:fill="BBE33D" w:val="clear"/>
+        </w:rPr>
+        <w:t>population_on_1_january_by_broad_age_group_sex_and_NUTS_3_region</w:t>
       </w:r>
     </w:p>
     <w:p>
@@ -8462,7 +8491,17 @@
           <w:sz w:val="12"/>
           <w:szCs w:val="12"/>
         </w:rPr>
-        <w:t>name: employment_thousand_persons_by_NUTS_3_region</w:t>
+        <w:t xml:space="preserve">name: </w:t>
+      </w:r>
+      <w:r>
+        <w:rPr>
+          <w:b/>
+          <w:bCs/>
+          <w:sz w:val="12"/>
+          <w:szCs w:val="12"/>
+          <w:shd w:fill="BBE33D" w:val="clear"/>
+        </w:rPr>
+        <w:t>employment_thousand_persons_by_NUTS_3_region</w:t>
       </w:r>
     </w:p>
     <w:p>
@@ -10640,8 +10679,8 @@
       <w14:ligatures w14:val="none"/>
     </w:rPr>
   </w:style>
-  <w:style w:type="numbering" w:styleId="Ningunalistauser" w:default="1">
-    <w:name w:val="Ninguna lista (user)"/>
+  <w:style w:type="numbering" w:styleId="Ningunalista" w:default="1">
+    <w:name w:val="Ninguna lista"/>
     <w:uiPriority w:val="99"/>
     <w:semiHidden/>
     <w:unhideWhenUsed/>

</xml_diff>